<commit_message>
Enhance Project Document with Priority Score calculation
</commit_message>
<xml_diff>
--- a/Project/Documentation/Project_Topic_Document_toDoList.docx
+++ b/Project/Documentation/Project_Topic_Document_toDoList.docx
@@ -757,41 +757,78 @@
           <w:tcPr>
             <w:tcW w:w="9350" w:type="dxa"/>
           </w:tcPr>
-          <w:p/>
-          <w:p>
-            <w:r>
-              <w:t>The application will calculate the total estimated time for unfinished tasks.</w:t>
-            </w:r>
-          </w:p>
-          <w:p>
-            <w:r>
-              <w:t xml:space="preserve">The calculation will </w:t>
-            </w:r>
-            <w:proofErr w:type="gramStart"/>
-            <w:r>
-              <w:t>add</w:t>
-            </w:r>
-            <w:proofErr w:type="gramEnd"/>
-            <w:r>
-              <w:t xml:space="preserve"> the estimated time of every task that is not marked as completed (undone).</w:t>
-            </w:r>
-          </w:p>
-          <w:p>
-            <w:r>
-              <w:t>Example:</w:t>
-            </w:r>
-          </w:p>
-          <w:p>
-            <w:r>
-              <w:t>30 minutes + 60 minutes + 45 minutes = 135 minutes of work remaining</w:t>
-            </w:r>
-          </w:p>
-          <w:p>
-            <w:r>
-              <w:t xml:space="preserve">The total can also be displayed in hours and minutes </w:t>
-            </w:r>
-          </w:p>
-          <w:p/>
+          <w:p>
+            <w:pPr>
+              <w:rPr>
+                <w:lang w:val="en-CA"/>
+              </w:rPr>
+            </w:pPr>
+            <w:r>
+              <w:rPr>
+                <w:lang w:val="en-CA"/>
+              </w:rPr>
+              <w:t>The application will calculate a Priority Score for each task. The score is determined by multiplying the estimated completion time by a priority value (High = 3, Medium = 2, Low = 1). Tasks with higher scores should be completed first.</w:t>
+            </w:r>
+          </w:p>
+          <w:p>
+            <w:pPr>
+              <w:rPr>
+                <w:lang w:val="en-CA"/>
+              </w:rPr>
+            </w:pPr>
+            <w:r>
+              <w:rPr>
+                <w:lang w:val="en-CA"/>
+              </w:rPr>
+              <w:t>For example:</w:t>
+            </w:r>
+          </w:p>
+          <w:p>
+            <w:pPr>
+              <w:rPr>
+                <w:lang w:val="en-CA"/>
+              </w:rPr>
+            </w:pPr>
+            <w:r>
+              <w:rPr>
+                <w:lang w:val="en-CA"/>
+              </w:rPr>
+              <w:t>Estimated Time = 60 minutes</w:t>
+            </w:r>
+          </w:p>
+          <w:p>
+            <w:pPr>
+              <w:rPr>
+                <w:lang w:val="en-CA"/>
+              </w:rPr>
+            </w:pPr>
+            <w:r>
+              <w:rPr>
+                <w:lang w:val="en-CA"/>
+              </w:rPr>
+              <w:t>Priority = High (3)</w:t>
+            </w:r>
+          </w:p>
+          <w:p>
+            <w:pPr>
+              <w:rPr>
+                <w:lang w:val="en-CA"/>
+              </w:rPr>
+            </w:pPr>
+            <w:r>
+              <w:rPr>
+                <w:lang w:val="en-CA"/>
+              </w:rPr>
+              <w:t>Priority Score = 180</w:t>
+            </w:r>
+          </w:p>
+          <w:p>
+            <w:pPr>
+              <w:rPr>
+                <w:lang w:val="en-CA"/>
+              </w:rPr>
+            </w:pPr>
+          </w:p>
         </w:tc>
       </w:tr>
     </w:tbl>
@@ -2078,11 +2115,12 @@
 </file>
 
 <file path=customXml/item1.xml><?xml version="1.0" encoding="utf-8"?>
-<p:properties xmlns:p="http://schemas.microsoft.com/office/2006/metadata/properties" xmlns:xsi="http://www.w3.org/2001/XMLSchema-instance" xmlns:pc="http://schemas.microsoft.com/office/infopath/2007/PartnerControls">
-  <documentManagement>
-    <_activity xmlns="ceed4965-665b-4493-8780-91ac95584bb8" xsi:nil="true"/>
-  </documentManagement>
-</p:properties>
+<?mso-contentType ?>
+<FormTemplates xmlns="http://schemas.microsoft.com/sharepoint/v3/contenttype/forms">
+  <Display>DocumentLibraryForm</Display>
+  <Edit>DocumentLibraryForm</Edit>
+  <New>DocumentLibraryForm</New>
+</FormTemplates>
 </file>
 
 <file path=customXml/item2.xml><?xml version="1.0" encoding="utf-8"?>
@@ -2268,20 +2306,17 @@
 </file>
 
 <file path=customXml/item3.xml><?xml version="1.0" encoding="utf-8"?>
-<?mso-contentType ?>
-<FormTemplates xmlns="http://schemas.microsoft.com/sharepoint/v3/contenttype/forms">
-  <Display>DocumentLibraryForm</Display>
-  <Edit>DocumentLibraryForm</Edit>
-  <New>DocumentLibraryForm</New>
-</FormTemplates>
+<p:properties xmlns:p="http://schemas.microsoft.com/office/2006/metadata/properties" xmlns:xsi="http://www.w3.org/2001/XMLSchema-instance" xmlns:pc="http://schemas.microsoft.com/office/infopath/2007/PartnerControls">
+  <documentManagement>
+    <_activity xmlns="ceed4965-665b-4493-8780-91ac95584bb8" xsi:nil="true"/>
+  </documentManagement>
+</p:properties>
 </file>
 
 <file path=customXml/itemProps1.xml><?xml version="1.0" encoding="utf-8"?>
-<ds:datastoreItem xmlns:ds="http://schemas.openxmlformats.org/officeDocument/2006/customXml" ds:itemID="{FE158F57-CEE9-4811-BBAE-E1A9A2E1B0DE}">
+<ds:datastoreItem xmlns:ds="http://schemas.openxmlformats.org/officeDocument/2006/customXml" ds:itemID="{772259C4-8C04-4026-BDED-E9C0B3F77DB8}">
   <ds:schemaRefs>
-    <ds:schemaRef ds:uri="http://schemas.microsoft.com/office/2006/metadata/properties"/>
-    <ds:schemaRef ds:uri="http://schemas.microsoft.com/office/infopath/2007/PartnerControls"/>
-    <ds:schemaRef ds:uri="ceed4965-665b-4493-8780-91ac95584bb8"/>
+    <ds:schemaRef ds:uri="http://schemas.microsoft.com/sharepoint/v3/contenttype/forms"/>
   </ds:schemaRefs>
 </ds:datastoreItem>
 </file>
@@ -2305,9 +2340,11 @@
 </file>
 
 <file path=customXml/itemProps3.xml><?xml version="1.0" encoding="utf-8"?>
-<ds:datastoreItem xmlns:ds="http://schemas.openxmlformats.org/officeDocument/2006/customXml" ds:itemID="{772259C4-8C04-4026-BDED-E9C0B3F77DB8}">
+<ds:datastoreItem xmlns:ds="http://schemas.openxmlformats.org/officeDocument/2006/customXml" ds:itemID="{FE158F57-CEE9-4811-BBAE-E1A9A2E1B0DE}">
   <ds:schemaRefs>
-    <ds:schemaRef ds:uri="http://schemas.microsoft.com/sharepoint/v3/contenttype/forms"/>
+    <ds:schemaRef ds:uri="http://schemas.microsoft.com/office/2006/metadata/properties"/>
+    <ds:schemaRef ds:uri="http://schemas.microsoft.com/office/infopath/2007/PartnerControls"/>
+    <ds:schemaRef ds:uri="ceed4965-665b-4493-8780-91ac95584bb8"/>
   </ds:schemaRefs>
 </ds:datastoreItem>
 </file>
</xml_diff>